<commit_message>
Update portfolio with latest CV information and projects
</commit_message>
<xml_diff>
--- a/public/Hamza_CV.docx
+++ b/public/Hamza_CV.docx
@@ -45,7 +45,7 @@
         </w:rPr>
         <w:t xml:space="preserve">Lahore, Pakistan (open to remote)  ·  +92 337 706 0143  ·  hamzaanwaar4@gmail.com  ·  </w:t>
       </w:r>
-      <w:hyperlink w:history="1" r:id="rIdu5qik2aqm5hecn2nkpt6h">
+      <w:hyperlink w:history="1" r:id="rIdvc8xs6apdnbdyuzd21m7-">
         <w:r>
           <w:rPr>
             <w:rFonts w:ascii="Arial" w:cs="Arial" w:eastAsia="Arial" w:hAnsi="Arial"/>
@@ -66,7 +66,7 @@
         </w:rPr>
         <w:t xml:space="preserve">  ·  </w:t>
       </w:r>
-      <w:hyperlink w:history="1" r:id="rIdb20bnfwnqa_muebnvgljp">
+      <w:hyperlink w:history="1" r:id="rIdhd4vmvcqkqh6vmwh7ntuz">
         <w:r>
           <w:rPr>
             <w:rFonts w:ascii="Arial" w:cs="Arial" w:eastAsia="Arial" w:hAnsi="Arial"/>
@@ -87,7 +87,7 @@
         </w:rPr>
         <w:t xml:space="preserve">  ·  </w:t>
       </w:r>
-      <w:hyperlink w:history="1" r:id="rId5qs0vzivjzoo_nxut42po">
+      <w:hyperlink w:history="1" r:id="rIdvaiwyymkjrhan9byboxm3">
         <w:r>
           <w:rPr>
             <w:rFonts w:ascii="Arial" w:cs="Arial" w:eastAsia="Arial" w:hAnsi="Arial"/>
@@ -139,7 +139,7 @@
           <w:sz w:val="20"/>
           <w:szCs w:val="20"/>
         </w:rPr>
-        <w:t xml:space="preserve">Backend engineer with 14+ months of production experience building REST APIs, AI automation pipelines, and enterprise voice systems. Shipped 12+ production endpoints and a real-time Workday HR voice bot (Retell AI + GPT-4o + SOAP/XML) used in live environments. Proficient in Python, FastAPI, Django REST Framework, PostgreSQL, Docker, and CI/CD. Experienced with agile workflows, unit testing (pytest), and end-to-end feature ownership. Open to remote and international roles.</w:t>
+        <w:t xml:space="preserve">Backend engineer with 14+ months of production experience building REST APIs, AI pipelines, distributed systems, and enterprise voice automation. Shipped 12+ production endpoints and a real-time Workday HR voice bot (Retell AI + GPT-4o + SOAP/XML). Stack includes Python, FastAPI, Django REST Framework, PostgreSQL, Redis, Celery, Kafka, Docker, and Kubernetes. Built LangChain and vector database (Pinecone/Chroma) powered RAG pipelines. Experienced with agile workflows, unit testing (pytest), and end-to-end feature ownership. Open to remote and international roles.</w:t>
       </w:r>
     </w:p>
     <w:p>
@@ -371,6 +371,66 @@
           <w:szCs w:val="20"/>
         </w:rPr>
         <w:t xml:space="preserve">PostgreSQL schemas with relational modeling, indexing, and ORM query optimization; maintained unit testing and integration testing coverage using pytest across all production endpoints.</w:t>
+      </w:r>
+    </w:p>
+    <w:p>
+      <w:pPr>
+        <w:pStyle w:val="ListParagraph"/>
+        <w:numPr>
+          <w:ilvl w:val="0"/>
+          <w:numId w:val="2"/>
+        </w:numPr>
+        <w:spacing w:after="40" w:before="40"/>
+      </w:pPr>
+      <w:r>
+        <w:rPr>
+          <w:rFonts w:ascii="Arial" w:cs="Arial" w:eastAsia="Arial" w:hAnsi="Arial"/>
+          <w:b/>
+          <w:bCs/>
+          <w:color w:val="1E2A3B"/>
+          <w:sz w:val="20"/>
+          <w:szCs w:val="20"/>
+        </w:rPr>
+        <w:t xml:space="preserve">Implemented </w:t>
+      </w:r>
+      <w:r>
+        <w:rPr>
+          <w:rFonts w:ascii="Arial" w:cs="Arial" w:eastAsia="Arial" w:hAnsi="Arial"/>
+          <w:color w:val="4B5563"/>
+          <w:sz w:val="20"/>
+          <w:szCs w:val="20"/>
+        </w:rPr>
+        <w:t xml:space="preserve">Redis for API response caching and session management; Celery for async background task processing; Apache Kafka for event streaming between services; Kubernetes (K8s) for container orchestration across staging and production environments.</w:t>
+      </w:r>
+    </w:p>
+    <w:p>
+      <w:pPr>
+        <w:pStyle w:val="ListParagraph"/>
+        <w:numPr>
+          <w:ilvl w:val="0"/>
+          <w:numId w:val="2"/>
+        </w:numPr>
+        <w:spacing w:after="40" w:before="40"/>
+      </w:pPr>
+      <w:r>
+        <w:rPr>
+          <w:rFonts w:ascii="Arial" w:cs="Arial" w:eastAsia="Arial" w:hAnsi="Arial"/>
+          <w:b/>
+          <w:bCs/>
+          <w:color w:val="1E2A3B"/>
+          <w:sz w:val="20"/>
+          <w:szCs w:val="20"/>
+        </w:rPr>
+        <w:t xml:space="preserve">Built </w:t>
+      </w:r>
+      <w:r>
+        <w:rPr>
+          <w:rFonts w:ascii="Arial" w:cs="Arial" w:eastAsia="Arial" w:hAnsi="Arial"/>
+          <w:color w:val="4B5563"/>
+          <w:sz w:val="20"/>
+          <w:szCs w:val="20"/>
+        </w:rPr>
+        <w:t xml:space="preserve">LangChain-based RAG pipelines integrating vector databases (Pinecone/Chroma) for semantic search and context-aware AI responses — used in production AI workflow automation features.</w:t>
       </w:r>
     </w:p>
     <w:p>
@@ -849,7 +909,7 @@
                 <w:sz w:val="19"/>
                 <w:szCs w:val="19"/>
               </w:rPr>
-              <w:t xml:space="preserve">AI &amp; Voice</w:t>
+              <w:t xml:space="preserve">AI &amp; RAG</w:t>
             </w:r>
           </w:p>
         </w:tc>
@@ -877,7 +937,67 @@
                 <w:sz w:val="19"/>
                 <w:szCs w:val="19"/>
               </w:rPr>
-              <w:t xml:space="preserve">OpenAI GPT-4o, Retell AI, LLM automation, prompt engineering, voice agent pipelines, AI workflow automation</w:t>
+              <w:t xml:space="preserve">OpenAI GPT-4o, Retell AI, LangChain, vector databases (Pinecone, Chroma), RAG pipelines, LLM automation, prompt engineering</w:t>
+            </w:r>
+          </w:p>
+        </w:tc>
+      </w:tr>
+      <w:tr>
+        <w:tc>
+          <w:tcPr>
+            <w:tcW w:type="dxa" w:w="2000"/>
+            <w:tcBorders>
+              <w:top w:val="none" w:color="FFFFFF" w:sz="0"/>
+              <w:left w:val="none" w:color="FFFFFF" w:sz="0"/>
+              <w:bottom w:val="none" w:color="FFFFFF" w:sz="0"/>
+              <w:right w:val="none" w:color="FFFFFF" w:sz="0"/>
+            </w:tcBorders>
+            <w:tcMar>
+              <w:top w:type="dxa" w:w="50"/>
+              <w:left w:type="dxa" w:w="0"/>
+              <w:bottom w:type="dxa" w:w="50"/>
+              <w:right w:type="dxa" w:w="120"/>
+            </w:tcMar>
+          </w:tcPr>
+          <w:p>
+            <w:r>
+              <w:rPr>
+                <w:rFonts w:ascii="Arial" w:cs="Arial" w:eastAsia="Arial" w:hAnsi="Arial"/>
+                <w:b/>
+                <w:bCs/>
+                <w:color w:val="1E2A3B"/>
+                <w:sz w:val="19"/>
+                <w:szCs w:val="19"/>
+              </w:rPr>
+              <w:t xml:space="preserve">Messaging</w:t>
+            </w:r>
+          </w:p>
+        </w:tc>
+        <w:tc>
+          <w:tcPr>
+            <w:tcW w:type="dxa" w:w="7360"/>
+            <w:tcBorders>
+              <w:top w:val="none" w:color="FFFFFF" w:sz="0"/>
+              <w:left w:val="none" w:color="FFFFFF" w:sz="0"/>
+              <w:bottom w:val="none" w:color="FFFFFF" w:sz="0"/>
+              <w:right w:val="none" w:color="FFFFFF" w:sz="0"/>
+            </w:tcBorders>
+            <w:tcMar>
+              <w:top w:type="dxa" w:w="50"/>
+              <w:left w:type="dxa" w:w="0"/>
+              <w:bottom w:type="dxa" w:w="50"/>
+              <w:right w:type="dxa" w:w="0"/>
+            </w:tcMar>
+          </w:tcPr>
+          <w:p>
+            <w:r>
+              <w:rPr>
+                <w:rFonts w:ascii="Arial" w:cs="Arial" w:eastAsia="Arial" w:hAnsi="Arial"/>
+                <w:color w:val="4B5563"/>
+                <w:sz w:val="19"/>
+                <w:szCs w:val="19"/>
+              </w:rPr>
+              <w:t xml:space="preserve">Apache Kafka, Celery, async task queues, event-driven architecture</w:t>
             </w:r>
           </w:p>
         </w:tc>
@@ -937,7 +1057,7 @@
                 <w:sz w:val="19"/>
                 <w:szCs w:val="19"/>
               </w:rPr>
-              <w:t xml:space="preserve">Docker, docker-compose, Git &amp; GitHub, Linux/Ubuntu CLI, CI/CD pipelines, agile development</w:t>
+              <w:t xml:space="preserve">Docker, docker-compose, Kubernetes (K8s), Git &amp; GitHub, Linux/Ubuntu CLI, CI/CD pipelines, agile</w:t>
             </w:r>
           </w:p>
         </w:tc>
@@ -997,7 +1117,7 @@
                 <w:sz w:val="19"/>
                 <w:szCs w:val="19"/>
               </w:rPr>
-              <w:t xml:space="preserve">Workday SOAP/XML Web Services, REST API integration, webhook design, third-party API integration</w:t>
+              <w:t xml:space="preserve">Workday SOAP/XML, REST API integration, webhook design, third-party API integration</w:t>
             </w:r>
           </w:p>
         </w:tc>
@@ -1057,7 +1177,7 @@
                 <w:sz w:val="19"/>
                 <w:szCs w:val="19"/>
               </w:rPr>
-              <w:t xml:space="preserve">PostgreSQL, SQLite, Django ORM, Pydantic, schema design, query optimization, indexing</w:t>
+              <w:t xml:space="preserve">PostgreSQL, Redis, SQLite, Django ORM, Pydantic, schema design, query optimization, indexing</w:t>
             </w:r>
           </w:p>
         </w:tc>

</xml_diff>